<commit_message>
fix: cria estilo dedicado SCL Figure Caption em vez de overrides manuais
Atende ao pedido do revisor no PR #1358 (issue #1346): o espacamento
correto da legenda de figura (line_spacing=1.0, space_after=5.65pt) agora
vive nativamente no layout.docx, num estilo dedicado "SCL Figure Caption"
(baseado em "Table Heading"), em vez de overrides manuais em Python por
cima do estilo "SCL Table Heading" - que ate entao era compartilhado
entre legenda de tabela e de figura sem nenhuma relacao semantica entre
os dois usos.

add_figure passa a usar "SCL Figure Caption" como header_style_name
padrao; os overrides de paragraph_format em _add_caption sao removidos,
ja que a formatacao agora vem do proprio estilo.

Validado: 0 pixels de diferenca entre o render desta versao e o render
da versao anterior (overrides em Python) para o mesmo artigo real
(a10.xml, corpus layout_examples_rafael).
</commit_message>
<xml_diff>
--- a/tests/fixtures/pdf/layout.docx
+++ b/tests/fixtures/pdf/layout.docx
@@ -14321,6 +14321,14 @@
     <w:tblStylePr w:type="wholeTable">
       <w:tblPr/>
     </w:tblStylePr>
+  </w:style>
+  <w:style w:type="paragraph" w:customStyle="1" w:styleId="SCLFigureCaption">
+    <w:name w:val="SCL Figure Caption"/>
+    <w:basedOn w:val="TableHeading"/>
+    <w:qFormat/>
+    <w:pPr>
+      <w:spacing w:line="240" w:lineRule="auto" w:after="113"/>
+    </w:pPr>
   </w:style>
 </w:styles>
 </file>

</xml_diff>

<commit_message>
fix: corrige tamanho de fonte de formula estourando coluna no PDF (#1385)
LibreOffice ignora w:sz/w:rFonts de zonas de matematica OOXML e usa seu
BaseSize interno (12pt), maior que o corpo do artigo (8pt). Corrigido
via perfil do LibreOffice com BaseSize=8 patcheado no
registrymodifications.xcu, aplicado por chamada de convert_docx_to_pdf
sem dependencia nova. Tambem adiciona o estilo "SCL Formula" (alinhado
a esquerda) para paragrafos com formula, evitando o espacamento
esticado do rotulo de texto quando o paragrafo e justificado.
</commit_message>
<xml_diff>
--- a/tests/fixtures/pdf/layout.docx
+++ b/tests/fixtures/pdf/layout.docx
@@ -14329,6 +14329,18 @@
     <w:pPr>
       <w:spacing w:line="240" w:lineRule="auto" w:after="113"/>
     </w:pPr>
+  </w:style>
+  <w:style w:type="paragraph" w:customStyle="1" w:styleId="SCLFormula">
+    <w:name w:val="SCL Formula"/>
+    <w:basedOn w:val="SCLParagraph"/>
+    <w:pPr>
+      <w:ind w:firstLine="0"/>
+      <w:jc w:val="left"/>
+    </w:pPr>
+    <w:rPr>
+      <w:rFonts w:ascii="Noto Serif" w:hAnsi="Noto Serif"/>
+      <w:sz w:val="16"/>
+    </w:rPr>
   </w:style>
 </w:styles>
 </file>

</xml_diff>